<commit_message>
fixed typo in resume
</commit_message>
<xml_diff>
--- a/assets/resume.docx
+++ b/assets/resume.docx
@@ -468,6 +468,7 @@
       <w:r>
         <w:rPr>
           <w:rFonts w:ascii="Times New Roman" w:eastAsia="Tahoma" w:hAnsi="Times New Roman" w:cs="Times New Roman"/>
+          <w:noProof/>
           <w:sz w:val="22"/>
           <w:szCs w:val="22"/>
           <w:lang w:val="en-US"/>
@@ -507,7 +508,49 @@
         <w:rPr>
           <w:color w:val="auto"/>
         </w:rPr>
-        <w:t xml:space="preserve">Dedicated and growth-focused professional with a solid physics background currently pursuing a career as a software engineer while completing a master's in medical </w:t>
+        <w:t xml:space="preserve">Dedicated and growth-focused professional with a solid </w:t>
+      </w:r>
+      <w:r>
+        <w:rPr>
+          <w:color w:val="auto"/>
+        </w:rPr>
+        <w:t>background</w:t>
+      </w:r>
+      <w:r>
+        <w:rPr>
+          <w:color w:val="auto"/>
+        </w:rPr>
+        <w:t xml:space="preserve"> in</w:t>
+      </w:r>
+      <w:r>
+        <w:rPr>
+          <w:color w:val="auto"/>
+        </w:rPr>
+        <w:t xml:space="preserve"> physics</w:t>
+      </w:r>
+      <w:r>
+        <w:rPr>
+          <w:color w:val="auto"/>
+        </w:rPr>
+        <w:t xml:space="preserve">, </w:t>
+      </w:r>
+      <w:r>
+        <w:rPr>
+          <w:color w:val="auto"/>
+        </w:rPr>
+        <w:t>currently pursuing a career as a software engineer while completing a master's in medical</w:t>
+      </w:r>
+      <w:r>
+        <w:rPr>
+          <w:color w:val="auto"/>
+        </w:rPr>
+        <w:t xml:space="preserve"> and radiation</w:t>
+      </w:r>
+      <w:r>
+        <w:rPr>
+          <w:color w:val="auto"/>
+        </w:rPr>
+        <w:t xml:space="preserve"> </w:t>
       </w:r>
       <w:r>
         <w:rPr>
@@ -670,22 +713,17 @@
         <w:tblLook w:val="04A0" w:firstRow="1" w:lastRow="0" w:firstColumn="1" w:lastColumn="0" w:noHBand="0" w:noVBand="1"/>
       </w:tblPr>
       <w:tblGrid>
-        <w:gridCol w:w="7290"/>
-        <w:gridCol w:w="625"/>
-        <w:gridCol w:w="2880"/>
+        <w:gridCol w:w="8635"/>
+        <w:gridCol w:w="270"/>
+        <w:gridCol w:w="1890"/>
       </w:tblGrid>
       <w:tr>
         <w:tc>
           <w:tcPr>
-            <w:tcW w:w="7290" w:type="dxa"/>
+            <w:tcW w:w="8635" w:type="dxa"/>
           </w:tcPr>
           <w:p>
             <w:pPr>
-              <w:pStyle w:val="ListParagraph"/>
-              <w:numPr>
-                <w:ilvl w:val="0"/>
-                <w:numId w:val="29"/>
-              </w:numPr>
               <w:rPr>
                 <w:rFonts w:asciiTheme="minorHAnsi" w:eastAsia="Tahoma" w:hAnsiTheme="minorHAnsi" w:cstheme="minorHAnsi"/>
                 <w:b/>
@@ -700,13 +738,31 @@
                 <w:color w:val="000000" w:themeColor="text1"/>
                 <w:lang w:val="en-US"/>
               </w:rPr>
-              <w:t>MSc in Medical Physics / National and Kapodistrian University of Athens</w:t>
+              <w:t>MSc in Medical Physics</w:t>
+            </w:r>
+            <w:r>
+              <w:rPr>
+                <w:rFonts w:asciiTheme="minorHAnsi" w:eastAsia="Tahoma" w:hAnsiTheme="minorHAnsi" w:cstheme="minorHAnsi"/>
+                <w:b/>
+                <w:color w:val="000000" w:themeColor="text1"/>
+                <w:lang w:val="en-US"/>
+              </w:rPr>
+              <w:t xml:space="preserve"> – Radiation Physics</w:t>
+            </w:r>
+            <w:r>
+              <w:rPr>
+                <w:rFonts w:asciiTheme="minorHAnsi" w:eastAsia="Tahoma" w:hAnsiTheme="minorHAnsi" w:cstheme="minorHAnsi"/>
+                <w:b/>
+                <w:color w:val="000000" w:themeColor="text1"/>
+                <w:lang w:val="en-US"/>
+              </w:rPr>
+              <w:t xml:space="preserve"> / National and Kapodistrian University of Athens</w:t>
             </w:r>
           </w:p>
         </w:tc>
         <w:tc>
           <w:tcPr>
-            <w:tcW w:w="625" w:type="dxa"/>
+            <w:tcW w:w="270" w:type="dxa"/>
           </w:tcPr>
           <w:p>
             <w:pPr>
@@ -722,12 +778,10 @@
         </w:tc>
         <w:tc>
           <w:tcPr>
-            <w:tcW w:w="2880" w:type="dxa"/>
+            <w:tcW w:w="1890" w:type="dxa"/>
           </w:tcPr>
           <w:p>
             <w:pPr>
-              <w:ind w:left="524"/>
-              <w:jc w:val="right"/>
               <w:rPr>
                 <w:rFonts w:asciiTheme="minorHAnsi" w:eastAsia="Tahoma" w:hAnsiTheme="minorHAnsi" w:cstheme="minorHAnsi"/>
                 <w:b/>
@@ -783,10 +837,10 @@
         <w:t>Relevant Coursework: Medical Statistics</w:t>
       </w:r>
       <w:r>
-        <w:t xml:space="preserve"> |</w:t>
-      </w:r>
-      <w:r>
-        <w:t xml:space="preserve"> Informatics and Image Processing</w:t>
+        <w:t xml:space="preserve">, </w:t>
+      </w:r>
+      <w:r>
+        <w:t>Informatics and Image Processing</w:t>
       </w:r>
     </w:p>
     <w:p>
@@ -828,11 +882,6 @@
           </w:tcPr>
           <w:p>
             <w:pPr>
-              <w:pStyle w:val="ListParagraph"/>
-              <w:numPr>
-                <w:ilvl w:val="0"/>
-                <w:numId w:val="29"/>
-              </w:numPr>
               <w:rPr>
                 <w:rFonts w:asciiTheme="minorHAnsi" w:eastAsia="Tahoma" w:hAnsiTheme="minorHAnsi" w:cstheme="minorHAnsi"/>
                 <w:b/>
@@ -992,11 +1041,6 @@
           </w:tcPr>
           <w:p>
             <w:pPr>
-              <w:pStyle w:val="ListParagraph"/>
-              <w:numPr>
-                <w:ilvl w:val="0"/>
-                <w:numId w:val="34"/>
-              </w:numPr>
               <w:rPr>
                 <w:rFonts w:asciiTheme="minorHAnsi" w:eastAsia="Tahoma" w:hAnsiTheme="minorHAnsi" w:cstheme="minorHAnsi"/>
                 <w:b/>
@@ -1011,25 +1055,7 @@
                 <w:color w:val="000000" w:themeColor="text1"/>
                 <w:lang w:val="en-US"/>
               </w:rPr>
-              <w:t xml:space="preserve">Physics and Mathematics Tutor </w:t>
-            </w:r>
-            <w:r>
-              <w:rPr>
-                <w:rFonts w:asciiTheme="minorHAnsi" w:eastAsia="Tahoma" w:hAnsiTheme="minorHAnsi" w:cstheme="minorHAnsi"/>
-                <w:b/>
-                <w:color w:val="000000" w:themeColor="text1"/>
-                <w:lang w:val="en-US"/>
-              </w:rPr>
-              <w:t xml:space="preserve">/ </w:t>
-            </w:r>
-            <w:r>
-              <w:rPr>
-                <w:rFonts w:asciiTheme="minorHAnsi" w:eastAsia="Tahoma" w:hAnsiTheme="minorHAnsi" w:cstheme="minorHAnsi"/>
-                <w:b/>
-                <w:color w:val="000000" w:themeColor="text1"/>
-                <w:lang w:val="en-US"/>
-              </w:rPr>
-              <w:t>Self-employed</w:t>
+              <w:t>Physics and Mathematics Tutor / Self-employed</w:t>
             </w:r>
           </w:p>
         </w:tc>
@@ -1087,7 +1113,10 @@
         <w:pStyle w:val="bullets"/>
       </w:pPr>
       <w:r>
-        <w:t>Tailored education with personalized study materials, customized exams, and teaching methods to match unique student needs</w:t>
+        <w:t>Tailored</w:t>
+      </w:r>
+      <w:r>
+        <w:t xml:space="preserve"> education with personalized study materials, customized exams, and teaching methods to match unique student needs</w:t>
       </w:r>
     </w:p>
     <w:p>
@@ -1098,7 +1127,7 @@
     <w:tbl>
       <w:tblPr>
         <w:tblStyle w:val="TableGrid"/>
-        <w:tblW w:w="10790" w:type="dxa"/>
+        <w:tblW w:w="11045" w:type="dxa"/>
         <w:tblBorders>
           <w:top w:val="none" w:sz="0" w:space="0" w:color="auto"/>
           <w:left w:val="none" w:sz="0" w:space="0" w:color="auto"/>
@@ -1110,23 +1139,19 @@
         <w:tblLook w:val="04A0" w:firstRow="1" w:lastRow="0" w:firstColumn="1" w:lastColumn="0" w:noHBand="0" w:noVBand="1"/>
       </w:tblPr>
       <w:tblGrid>
-        <w:gridCol w:w="4410"/>
-        <w:gridCol w:w="3505"/>
-        <w:gridCol w:w="2875"/>
+        <w:gridCol w:w="3462"/>
+        <w:gridCol w:w="2572"/>
+        <w:gridCol w:w="2572"/>
+        <w:gridCol w:w="2439"/>
       </w:tblGrid>
       <w:tr>
         <w:tc>
           <w:tcPr>
-            <w:tcW w:w="4410" w:type="dxa"/>
+            <w:tcW w:w="3462" w:type="dxa"/>
             <w:vAlign w:val="center"/>
           </w:tcPr>
           <w:p>
             <w:pPr>
-              <w:pStyle w:val="ListParagraph"/>
-              <w:numPr>
-                <w:ilvl w:val="0"/>
-                <w:numId w:val="29"/>
-              </w:numPr>
               <w:rPr>
                 <w:rFonts w:asciiTheme="minorHAnsi" w:eastAsia="Tahoma" w:hAnsiTheme="minorHAnsi" w:cstheme="minorHAnsi"/>
                 <w:b/>
@@ -1147,7 +1172,23 @@
         </w:tc>
         <w:tc>
           <w:tcPr>
-            <w:tcW w:w="3505" w:type="dxa"/>
+            <w:tcW w:w="2572" w:type="dxa"/>
+          </w:tcPr>
+          <w:p>
+            <w:pPr>
+              <w:ind w:left="360"/>
+              <w:rPr>
+                <w:rFonts w:asciiTheme="minorHAnsi" w:eastAsia="Tahoma" w:hAnsiTheme="minorHAnsi" w:cstheme="minorHAnsi"/>
+                <w:b/>
+                <w:color w:val="000000" w:themeColor="text1"/>
+                <w:lang w:val="en-US"/>
+              </w:rPr>
+            </w:pPr>
+          </w:p>
+        </w:tc>
+        <w:tc>
+          <w:tcPr>
+            <w:tcW w:w="2572" w:type="dxa"/>
             <w:vAlign w:val="center"/>
           </w:tcPr>
           <w:p>
@@ -1164,7 +1205,7 @@
         </w:tc>
         <w:tc>
           <w:tcPr>
-            <w:tcW w:w="2875" w:type="dxa"/>
+            <w:tcW w:w="2439" w:type="dxa"/>
             <w:vAlign w:val="center"/>
           </w:tcPr>
           <w:p>
@@ -1252,11 +1293,6 @@
           </w:tcPr>
           <w:p>
             <w:pPr>
-              <w:pStyle w:val="ListParagraph"/>
-              <w:numPr>
-                <w:ilvl w:val="0"/>
-                <w:numId w:val="29"/>
-              </w:numPr>
               <w:rPr>
                 <w:rFonts w:asciiTheme="minorHAnsi" w:eastAsia="Tahoma" w:hAnsiTheme="minorHAnsi" w:cstheme="minorHAnsi"/>
                 <w:b/>
@@ -1831,7 +1867,7 @@
         <v:path o:extrusionok="f" gradientshapeok="t" o:connecttype="rect"/>
         <o:lock v:ext="edit" aspectratio="t"/>
       </v:shapetype>
-      <v:shape id="_x0000_i1029" type="#_x0000_t75" alt="A blue square with white letters&#10;&#10;&#10;&#10;Description automatically generated" style="width:384pt;height:384pt;visibility:visible" o:bullet="t">
+      <v:shape id="_x0000_i1030" type="#_x0000_t75" alt="A blue square with white letters&#10;&#10;&#10;&#10;Description automatically generated" style="width:384pt;height:384pt;visibility:visible" o:bullet="t">
         <v:imagedata r:id="rId1" o:title="A blue square with white letters&#10;&#10;&#10;&#10;Description automatically generated"/>
       </v:shape>
     </w:pict>
@@ -2318,8 +2354,8 @@
   <w:abstractNum w:abstractNumId="4" w15:restartNumberingAfterBreak="0">
     <w:nsid w:val="0F83528B"/>
     <w:multiLevelType w:val="hybridMultilevel"/>
-    <w:tmpl w:val="1E3AE9EC"/>
-    <w:lvl w:ilvl="0" w:tplc="A13272A8">
+    <w:tmpl w:val="B8D69C4E"/>
+    <w:lvl w:ilvl="0" w:tplc="F9FCFACE">
       <w:start w:val="1"/>
       <w:numFmt w:val="bullet"/>
       <w:pStyle w:val="bullets"/>
@@ -8893,12 +8929,12 @@
     <w:basedOn w:val="NoSpacing"/>
     <w:link w:val="bulletsChar"/>
     <w:qFormat/>
-    <w:rsid w:val="00786A40"/>
+    <w:rsid w:val="00B829E6"/>
     <w:pPr>
       <w:numPr>
         <w:numId w:val="46"/>
       </w:numPr>
-      <w:ind w:right="432"/>
+      <w:ind w:left="792" w:right="432"/>
       <w:jc w:val="both"/>
     </w:pPr>
   </w:style>
@@ -8920,7 +8956,7 @@
     <w:name w:val="bullets Char"/>
     <w:basedOn w:val="NoSpacingChar"/>
     <w:link w:val="bullets"/>
-    <w:rsid w:val="00786A40"/>
+    <w:rsid w:val="00B829E6"/>
     <w:rPr>
       <w:rFonts w:eastAsia="Arial" w:cstheme="minorHAnsi"/>
       <w:color w:val="000000"/>

</xml_diff>

<commit_message>
added java in resume
</commit_message>
<xml_diff>
--- a/assets/resume.docx
+++ b/assets/resume.docx
@@ -642,10 +642,22 @@
         <w:pStyle w:val="bullets"/>
       </w:pPr>
       <w:r>
-        <w:t xml:space="preserve">Programming Languages: C | Python | </w:t>
-      </w:r>
-      <w:r>
-        <w:t>HTML, CSS | JavaScript | SQL | R</w:t>
+        <w:t xml:space="preserve">Programming Languages: </w:t>
+      </w:r>
+      <w:r>
+        <w:t xml:space="preserve">C | Python | HTML, CSS | JavaScript | </w:t>
+      </w:r>
+      <w:r>
+        <w:t>Java</w:t>
+      </w:r>
+      <w:r>
+        <w:t xml:space="preserve"> </w:t>
+      </w:r>
+      <w:r>
+        <w:t xml:space="preserve">| </w:t>
+      </w:r>
+      <w:r>
+        <w:t>SQL | R</w:t>
       </w:r>
       <w:r>
         <w:t xml:space="preserve"> | MATLAB</w:t>
@@ -826,7 +838,15 @@
         <w:t>s</w:t>
       </w:r>
       <w:r>
-        <w:t xml:space="preserve">: Computational simulations and use of A.I in Medical Physics </w:t>
+        <w:t xml:space="preserve">: Computational simulations and use of </w:t>
+      </w:r>
+      <w:proofErr w:type="spellStart"/>
+      <w:r>
+        <w:t>A.I</w:t>
+      </w:r>
+      <w:proofErr w:type="spellEnd"/>
+      <w:r>
+        <w:t xml:space="preserve"> in Medical Physics </w:t>
       </w:r>
     </w:p>
     <w:p>
@@ -1565,7 +1585,15 @@
         <w:pStyle w:val="bullets"/>
       </w:pPr>
       <w:r>
-        <w:t>Member of the EPS Young Minds team (NKUA Section) – European Physical Society</w:t>
+        <w:t>Member of the EPS Young Minds team (</w:t>
+      </w:r>
+      <w:proofErr w:type="spellStart"/>
+      <w:r>
+        <w:t>NKUA</w:t>
+      </w:r>
+      <w:proofErr w:type="spellEnd"/>
+      <w:r>
+        <w:t xml:space="preserve"> Section) – European Physical Society</w:t>
       </w:r>
     </w:p>
     <w:p>
@@ -1657,7 +1685,15 @@
         <w:t>tennis</w:t>
       </w:r>
       <w:r>
-        <w:t xml:space="preserve"> for the NKUA team, </w:t>
+        <w:t xml:space="preserve"> for the </w:t>
+      </w:r>
+      <w:proofErr w:type="spellStart"/>
+      <w:r>
+        <w:t>NKUA</w:t>
+      </w:r>
+      <w:proofErr w:type="spellEnd"/>
+      <w:r>
+        <w:t xml:space="preserve"> team, </w:t>
       </w:r>
       <w:r>
         <w:t>though</w:t>
@@ -1867,7 +1903,7 @@
         <v:path o:extrusionok="f" gradientshapeok="t" o:connecttype="rect"/>
         <o:lock v:ext="edit" aspectratio="t"/>
       </v:shapetype>
-      <v:shape id="_x0000_i1030" type="#_x0000_t75" alt="A blue square with white letters&#10;&#10;&#10;&#10;Description automatically generated" style="width:384pt;height:384pt;visibility:visible" o:bullet="t">
+      <v:shape id="_x0000_i1046" type="#_x0000_t75" alt="A blue square with white letters&#10;&#10;&#10;&#10;Description automatically generated" style="width:384pt;height:384pt;visibility:visible" o:bullet="t">
         <v:imagedata r:id="rId1" o:title="A blue square with white letters&#10;&#10;&#10;&#10;Description automatically generated"/>
       </v:shape>
     </w:pict>

</xml_diff>

<commit_message>
made resume 1 page
</commit_message>
<xml_diff>
--- a/assets/resume.docx
+++ b/assets/resume.docx
@@ -5,7 +5,6 @@
     <w:p>
       <w:pPr>
         <w:pStyle w:val="Title"/>
-        <w:spacing w:line="276" w:lineRule="auto"/>
         <w:jc w:val="center"/>
         <w:rPr>
           <w:rFonts w:ascii="Times New Roman" w:eastAsia="Tahoma" w:hAnsi="Times New Roman" w:cs="Times New Roman"/>
@@ -27,7 +26,6 @@
     <w:p>
       <w:pPr>
         <w:pStyle w:val="Title"/>
-        <w:spacing w:line="276" w:lineRule="auto"/>
         <w:jc w:val="center"/>
         <w:rPr>
           <w:rFonts w:ascii="Times New Roman" w:eastAsia="Tahoma" w:hAnsi="Times New Roman" w:cs="Times New Roman"/>
@@ -478,6 +476,7 @@
     </w:p>
     <w:p>
       <w:pPr>
+        <w:spacing w:line="240" w:lineRule="auto"/>
         <w:rPr>
           <w:lang w:val="en-US"/>
         </w:rPr>
@@ -485,143 +484,8 @@
     </w:p>
     <w:p>
       <w:pPr>
-        <w:pStyle w:val="Heading1"/>
-        <w:spacing w:before="240"/>
-      </w:pPr>
-      <w:r>
-        <w:t xml:space="preserve">PROFILE </w:t>
-      </w:r>
-      <w:r>
-        <w:t>SUMMARY</w:t>
-      </w:r>
-    </w:p>
-    <w:p>
-      <w:pPr>
         <w:pStyle w:val="NoSpacing"/>
-        <w:ind w:right="288"/>
-        <w:jc w:val="both"/>
-        <w:rPr>
-          <w:color w:val="auto"/>
-        </w:rPr>
-      </w:pPr>
-      <w:r>
-        <w:rPr>
-          <w:color w:val="auto"/>
-        </w:rPr>
-        <w:t xml:space="preserve">Dedicated and growth-focused professional with a solid </w:t>
-      </w:r>
-      <w:r>
-        <w:rPr>
-          <w:color w:val="auto"/>
-        </w:rPr>
-        <w:t>background</w:t>
-      </w:r>
-      <w:r>
-        <w:rPr>
-          <w:color w:val="auto"/>
-        </w:rPr>
-        <w:t xml:space="preserve"> in</w:t>
-      </w:r>
-      <w:r>
-        <w:rPr>
-          <w:color w:val="auto"/>
-        </w:rPr>
-        <w:t xml:space="preserve"> physics</w:t>
-      </w:r>
-      <w:r>
-        <w:rPr>
-          <w:color w:val="auto"/>
-        </w:rPr>
-        <w:t xml:space="preserve">, </w:t>
-      </w:r>
-      <w:r>
-        <w:rPr>
-          <w:color w:val="auto"/>
-        </w:rPr>
-        <w:t>currently pursuing a career as a software engineer while completing a master's in medical</w:t>
-      </w:r>
-      <w:r>
-        <w:rPr>
-          <w:color w:val="auto"/>
-        </w:rPr>
-        <w:t xml:space="preserve"> and radiation</w:t>
-      </w:r>
-      <w:r>
-        <w:rPr>
-          <w:color w:val="auto"/>
-        </w:rPr>
-        <w:t xml:space="preserve"> </w:t>
-      </w:r>
-      <w:r>
-        <w:rPr>
-          <w:color w:val="auto"/>
-        </w:rPr>
-        <w:t xml:space="preserve">physics. </w:t>
-      </w:r>
-      <w:r>
-        <w:rPr>
-          <w:color w:val="auto"/>
-        </w:rPr>
-        <w:t>Forward thinking team player with s</w:t>
-      </w:r>
-      <w:r>
-        <w:rPr>
-          <w:color w:val="auto"/>
-        </w:rPr>
-        <w:t>trong analytical and problem-solving abilities, coupled with a dedication to ongoing learning.</w:t>
-      </w:r>
-      <w:r>
-        <w:rPr>
-          <w:color w:val="auto"/>
-        </w:rPr>
-        <w:t xml:space="preserve"> Enthusiastic about the tech industry and committed to honing my expertise in software development.</w:t>
-      </w:r>
-      <w:r>
-        <w:rPr>
-          <w:color w:val="auto"/>
-        </w:rPr>
-        <w:t xml:space="preserve"> </w:t>
-      </w:r>
-      <w:r>
-        <w:rPr>
-          <w:color w:val="auto"/>
-        </w:rPr>
-        <w:t>A</w:t>
-      </w:r>
-      <w:r>
-        <w:rPr>
-          <w:color w:val="auto"/>
-        </w:rPr>
-        <w:t xml:space="preserve">ctively seeking opportunities to </w:t>
-      </w:r>
-      <w:r>
-        <w:rPr>
-          <w:color w:val="auto"/>
-        </w:rPr>
-        <w:t>prove myself and gain meaningful experience</w:t>
-      </w:r>
-      <w:r>
-        <w:rPr>
-          <w:color w:val="auto"/>
-        </w:rPr>
-        <w:t xml:space="preserve"> </w:t>
-      </w:r>
-      <w:r>
-        <w:rPr>
-          <w:color w:val="auto"/>
-        </w:rPr>
-        <w:t>in cutting-edge technologies and projects</w:t>
-      </w:r>
-      <w:r>
-        <w:rPr>
-          <w:color w:val="auto"/>
-        </w:rPr>
-        <w:t>.</w:t>
-      </w:r>
-    </w:p>
-    <w:p>
-      <w:pPr>
-        <w:pStyle w:val="NoSpacing"/>
+        <w:spacing w:line="240" w:lineRule="auto"/>
         <w:ind w:right="288"/>
         <w:jc w:val="both"/>
       </w:pPr>
@@ -640,6 +504,7 @@
     <w:p>
       <w:pPr>
         <w:pStyle w:val="bullets"/>
+        <w:spacing w:line="240" w:lineRule="auto"/>
       </w:pPr>
       <w:r>
         <w:t xml:space="preserve">Programming Languages: </w:t>
@@ -648,10 +513,7 @@
         <w:t xml:space="preserve">C | Python | HTML, CSS | JavaScript | </w:t>
       </w:r>
       <w:r>
-        <w:t>Java</w:t>
-      </w:r>
-      <w:r>
-        <w:t xml:space="preserve"> </w:t>
+        <w:t xml:space="preserve">Java </w:t>
       </w:r>
       <w:r>
         <w:t xml:space="preserve">| </w:t>
@@ -666,6 +528,7 @@
     <w:p>
       <w:pPr>
         <w:pStyle w:val="bullets"/>
+        <w:spacing w:line="240" w:lineRule="auto"/>
       </w:pPr>
       <w:r>
         <w:t xml:space="preserve">Frameworks / Technologies: </w:t>
@@ -689,6 +552,7 @@
     <w:p>
       <w:pPr>
         <w:pStyle w:val="bullets"/>
+        <w:spacing w:line="240" w:lineRule="auto"/>
       </w:pPr>
       <w:r>
         <w:t xml:space="preserve">Software: </w:t>
@@ -700,6 +564,7 @@
     <w:p>
       <w:pPr>
         <w:pStyle w:val="NoSpacing"/>
+        <w:spacing w:line="240" w:lineRule="auto"/>
       </w:pPr>
     </w:p>
     <w:p>
@@ -817,11 +682,13 @@
     <w:p>
       <w:pPr>
         <w:pStyle w:val="NoSpacing"/>
+        <w:spacing w:line="240" w:lineRule="auto"/>
       </w:pPr>
     </w:p>
     <w:p>
       <w:pPr>
         <w:pStyle w:val="bullets"/>
+        <w:spacing w:line="240" w:lineRule="auto"/>
       </w:pPr>
       <w:r>
         <w:t>Overall classification: 8.00 (expected) “VERY GOOD”</w:t>
@@ -830,6 +697,7 @@
     <w:p>
       <w:pPr>
         <w:pStyle w:val="bullets"/>
+        <w:spacing w:line="240" w:lineRule="auto"/>
       </w:pPr>
       <w:r>
         <w:t>Interest</w:t>
@@ -852,6 +720,7 @@
     <w:p>
       <w:pPr>
         <w:pStyle w:val="bullets"/>
+        <w:spacing w:line="240" w:lineRule="auto"/>
       </w:pPr>
       <w:r>
         <w:t>Relevant Coursework: Medical Statistics</w:t>
@@ -859,13 +728,19 @@
       <w:r>
         <w:t xml:space="preserve">, </w:t>
       </w:r>
+      <w:proofErr w:type="gramStart"/>
       <w:r>
-        <w:t>Informatics and Image Processing</w:t>
+        <w:t>Informatics</w:t>
+      </w:r>
+      <w:proofErr w:type="gramEnd"/>
+      <w:r>
+        <w:t xml:space="preserve"> and Image Processing</w:t>
       </w:r>
     </w:p>
     <w:p>
       <w:pPr>
         <w:pStyle w:val="bullets"/>
+        <w:spacing w:line="240" w:lineRule="auto"/>
       </w:pPr>
       <w:r>
         <w:t>MSc Thesis: “Assessment of brain activity at rest using Magnetic Resonance Imaging in patients with ischemic cerebral episodes”</w:t>
@@ -874,6 +749,7 @@
     <w:p>
       <w:pPr>
         <w:pStyle w:val="NoSpacing"/>
+        <w:spacing w:line="240" w:lineRule="auto"/>
       </w:pPr>
     </w:p>
     <w:tbl>
@@ -967,11 +843,13 @@
     <w:p>
       <w:pPr>
         <w:pStyle w:val="NoSpacing"/>
+        <w:spacing w:line="240" w:lineRule="auto"/>
       </w:pPr>
     </w:p>
     <w:p>
       <w:pPr>
         <w:pStyle w:val="bullets"/>
+        <w:spacing w:line="240" w:lineRule="auto"/>
       </w:pPr>
       <w:r>
         <w:t>Overall classification: 7.0</w:t>
@@ -986,6 +864,7 @@
     <w:p>
       <w:pPr>
         <w:pStyle w:val="bullets"/>
+        <w:spacing w:line="240" w:lineRule="auto"/>
       </w:pPr>
       <w:r>
         <w:t>Specialization: Nuclear and Particle Physics</w:t>
@@ -994,6 +873,7 @@
     <w:p>
       <w:pPr>
         <w:pStyle w:val="bullets"/>
+        <w:spacing w:line="240" w:lineRule="auto"/>
       </w:pPr>
       <w:r>
         <w:t xml:space="preserve">Relevant Coursework: </w:t>
@@ -1011,6 +891,7 @@
     <w:p>
       <w:pPr>
         <w:pStyle w:val="bullets"/>
+        <w:spacing w:line="240" w:lineRule="auto"/>
         <w:rPr>
           <w:rFonts w:ascii="Arial" w:hAnsi="Arial" w:cs="Arial"/>
           <w:sz w:val="22"/>
@@ -1024,6 +905,7 @@
     <w:p>
       <w:pPr>
         <w:pStyle w:val="NoSpacing"/>
+        <w:spacing w:line="240" w:lineRule="auto"/>
       </w:pPr>
     </w:p>
     <w:p>
@@ -1126,11 +1008,13 @@
     <w:p>
       <w:pPr>
         <w:pStyle w:val="NoSpacing"/>
+        <w:spacing w:line="240" w:lineRule="auto"/>
       </w:pPr>
     </w:p>
     <w:p>
       <w:pPr>
         <w:pStyle w:val="bullets"/>
+        <w:spacing w:line="240" w:lineRule="auto"/>
       </w:pPr>
       <w:r>
         <w:t>Tailored</w:t>
@@ -1142,6 +1026,7 @@
     <w:p>
       <w:pPr>
         <w:pStyle w:val="NoSpacing"/>
+        <w:spacing w:line="240" w:lineRule="auto"/>
       </w:pPr>
     </w:p>
     <w:tbl>
@@ -1255,11 +1140,13 @@
     <w:p>
       <w:pPr>
         <w:pStyle w:val="NoSpacing"/>
+        <w:spacing w:line="240" w:lineRule="auto"/>
       </w:pPr>
     </w:p>
     <w:p>
       <w:pPr>
         <w:pStyle w:val="bullets"/>
+        <w:spacing w:line="240" w:lineRule="auto"/>
       </w:pPr>
       <w:r>
         <w:t>Conducted lifeguard training sessions</w:t>
@@ -1268,6 +1155,7 @@
     <w:p>
       <w:pPr>
         <w:pStyle w:val="bullets"/>
+        <w:spacing w:line="240" w:lineRule="auto"/>
       </w:pPr>
       <w:r>
         <w:t>Managed lifeguard schedules and ensured team supervision and safety protocols were consistently maintained</w:t>
@@ -1276,6 +1164,7 @@
     <w:p>
       <w:pPr>
         <w:pStyle w:val="bullets"/>
+        <w:spacing w:line="240" w:lineRule="auto"/>
       </w:pPr>
       <w:r>
         <w:t>Attentively monitored aquatic activities, promptly responded to emergencies, and administered necessary first aid</w:t>
@@ -1284,6 +1173,7 @@
     <w:p>
       <w:pPr>
         <w:pStyle w:val="NoSpacing"/>
+        <w:spacing w:line="240" w:lineRule="auto"/>
       </w:pPr>
     </w:p>
     <w:tbl>
@@ -1378,11 +1268,13 @@
     <w:p>
       <w:pPr>
         <w:pStyle w:val="NoSpacing"/>
+        <w:spacing w:line="240" w:lineRule="auto"/>
       </w:pPr>
     </w:p>
     <w:p>
       <w:pPr>
         <w:pStyle w:val="bullets"/>
+        <w:spacing w:line="240" w:lineRule="auto"/>
       </w:pPr>
       <w:r>
         <w:t xml:space="preserve">Delivered comprehensive client service, including back-office work, data analysis, and </w:t>
@@ -1397,6 +1289,7 @@
     <w:p>
       <w:pPr>
         <w:pStyle w:val="bullets"/>
+        <w:spacing w:line="240" w:lineRule="auto"/>
       </w:pPr>
       <w:r>
         <w:t>Conducted in-depth trend analysis and generated insightful comments</w:t>
@@ -1405,6 +1298,7 @@
     <w:p>
       <w:pPr>
         <w:pStyle w:val="bullets"/>
+        <w:spacing w:line="240" w:lineRule="auto"/>
       </w:pPr>
       <w:r>
         <w:t xml:space="preserve">Achieved significant productivity boost and reduced presentation preparation time by </w:t>
@@ -1426,6 +1320,7 @@
           <w:ilvl w:val="0"/>
           <w:numId w:val="0"/>
         </w:numPr>
+        <w:spacing w:line="240" w:lineRule="auto"/>
         <w:ind w:left="648"/>
       </w:pPr>
     </w:p>
@@ -1434,7 +1329,6 @@
         <w:pStyle w:val="Heading1"/>
       </w:pPr>
       <w:r>
-        <w:lastRenderedPageBreak/>
         <w:t>FOREIGN LANGUAGES</w:t>
       </w:r>
     </w:p>
@@ -1544,6 +1438,7 @@
     <w:p>
       <w:pPr>
         <w:pStyle w:val="NoSpacing"/>
+        <w:spacing w:line="240" w:lineRule="auto"/>
       </w:pPr>
     </w:p>
     <w:p>
@@ -1557,6 +1452,7 @@
     <w:p>
       <w:pPr>
         <w:pStyle w:val="bullets"/>
+        <w:spacing w:line="240" w:lineRule="auto"/>
       </w:pPr>
       <w:r>
         <w:t xml:space="preserve">Volunteer member of </w:t>
@@ -1583,6 +1479,7 @@
     <w:p>
       <w:pPr>
         <w:pStyle w:val="bullets"/>
+        <w:spacing w:line="240" w:lineRule="auto"/>
       </w:pPr>
       <w:r>
         <w:t>Member of the EPS Young Minds team (</w:t>
@@ -1599,6 +1496,7 @@
     <w:p>
       <w:pPr>
         <w:pStyle w:val="NoSpacing"/>
+        <w:spacing w:line="240" w:lineRule="auto"/>
         <w:rPr>
           <w:rStyle w:val="Hyperlink"/>
           <w:rFonts w:eastAsia="Tahoma"/>
@@ -1608,163 +1506,6 @@
           <w:szCs w:val="18"/>
           <w:u w:val="none"/>
         </w:rPr>
-      </w:pPr>
-    </w:p>
-    <w:p>
-      <w:pPr>
-        <w:pStyle w:val="Heading1"/>
-      </w:pPr>
-      <w:r>
-        <w:t>INTERESTS</w:t>
-      </w:r>
-      <w:r>
-        <w:t xml:space="preserve"> AND HOBBIES</w:t>
-      </w:r>
-    </w:p>
-    <w:p>
-      <w:pPr>
-        <w:pStyle w:val="NoSpacing"/>
-        <w:ind w:right="288"/>
-        <w:jc w:val="both"/>
-      </w:pPr>
-      <w:r>
-        <w:t xml:space="preserve">Besides being a </w:t>
-      </w:r>
-      <w:r>
-        <w:rPr>
-          <w:b/>
-          <w:bCs/>
-        </w:rPr>
-        <w:t>scout</w:t>
-      </w:r>
-      <w:r>
-        <w:t xml:space="preserve"> for the better part of my life</w:t>
-      </w:r>
-      <w:r>
-        <w:t>,</w:t>
-      </w:r>
-      <w:r>
-        <w:t xml:space="preserve"> I try to </w:t>
-      </w:r>
-      <w:r>
-        <w:t>maintain an active lifestyle</w:t>
-      </w:r>
-      <w:r>
-        <w:t xml:space="preserve">. Whenever I need a break to clear my </w:t>
-      </w:r>
-      <w:r>
-        <w:t>head,</w:t>
-      </w:r>
-      <w:r>
-        <w:t xml:space="preserve"> I usually go </w:t>
-      </w:r>
-      <w:r>
-        <w:rPr>
-          <w:b/>
-          <w:bCs/>
-        </w:rPr>
-        <w:t xml:space="preserve">hiking </w:t>
-      </w:r>
-      <w:r>
-        <w:t>with my scout friends</w:t>
-      </w:r>
-      <w:r>
-        <w:t xml:space="preserve">. </w:t>
-      </w:r>
-      <w:r>
-        <w:t>Conquering Mount Olympus represents a major milestone in my hiking journey</w:t>
-      </w:r>
-      <w:r>
-        <w:t xml:space="preserve">. I currently play </w:t>
-      </w:r>
-      <w:r>
-        <w:rPr>
-          <w:b/>
-          <w:bCs/>
-        </w:rPr>
-        <w:t>tennis</w:t>
-      </w:r>
-      <w:r>
-        <w:t xml:space="preserve"> for the </w:t>
-      </w:r>
-      <w:proofErr w:type="spellStart"/>
-      <w:r>
-        <w:t>NKUA</w:t>
-      </w:r>
-      <w:proofErr w:type="spellEnd"/>
-      <w:r>
-        <w:t xml:space="preserve"> team, </w:t>
-      </w:r>
-      <w:r>
-        <w:t>though</w:t>
-      </w:r>
-      <w:r>
-        <w:t xml:space="preserve"> I don’t see myself going to Wimbledon anytime soon. </w:t>
-      </w:r>
-      <w:r>
-        <w:t xml:space="preserve">In my pursuit of valuable experiences, I </w:t>
-      </w:r>
-      <w:r>
-        <w:t>have a deep</w:t>
-      </w:r>
-      <w:r>
-        <w:t xml:space="preserve"> interest in </w:t>
-      </w:r>
-      <w:r>
-        <w:rPr>
-          <w:b/>
-          <w:bCs/>
-        </w:rPr>
-        <w:t>travel</w:t>
-      </w:r>
-      <w:r>
-        <w:rPr>
-          <w:b/>
-          <w:bCs/>
-        </w:rPr>
-        <w:t>ling</w:t>
-      </w:r>
-      <w:r>
-        <w:t xml:space="preserve"> and </w:t>
-      </w:r>
-      <w:r>
-        <w:rPr>
-          <w:b/>
-          <w:bCs/>
-        </w:rPr>
-        <w:t>extreme sports</w:t>
-      </w:r>
-      <w:r>
-        <w:t xml:space="preserve">. My aspirations include becoming a digital nomad, enabling me to work from anywhere across the globe. </w:t>
-      </w:r>
-      <w:r>
-        <w:t>I thrive on embracing challenges and stepping outside my comfort zone, which is why I enjoy various extreme sports.</w:t>
-      </w:r>
-      <w:r>
-        <w:t xml:space="preserve"> </w:t>
-      </w:r>
-      <w:r>
-        <w:t xml:space="preserve">I </w:t>
-      </w:r>
-      <w:r>
-        <w:t xml:space="preserve">take pride in my ability to rapidly acquire new skills through self-discipline. Notably, I taught myself how to </w:t>
-      </w:r>
-      <w:r>
-        <w:rPr>
-          <w:b/>
-          <w:bCs/>
-        </w:rPr>
-        <w:t>ski</w:t>
-      </w:r>
-      <w:r>
-        <w:t>, which now allows me to combine my love for extreme sports with the mountains, making winter my favorite season for outdoor adventures.</w:t>
-      </w:r>
-    </w:p>
-    <w:p>
-      <w:pPr>
-        <w:pStyle w:val="NoSpacing"/>
-        <w:ind w:right="288"/>
-        <w:jc w:val="both"/>
       </w:pPr>
     </w:p>
     <w:p>
@@ -1788,6 +1529,7 @@
     <w:p>
       <w:pPr>
         <w:pStyle w:val="bullets"/>
+        <w:spacing w:line="240" w:lineRule="auto"/>
       </w:pPr>
       <w:r>
         <w:rPr>
@@ -1903,7 +1645,7 @@
         <v:path o:extrusionok="f" gradientshapeok="t" o:connecttype="rect"/>
         <o:lock v:ext="edit" aspectratio="t"/>
       </v:shapetype>
-      <v:shape id="_x0000_i1046" type="#_x0000_t75" alt="A blue square with white letters&#10;&#10;&#10;&#10;Description automatically generated" style="width:384pt;height:384pt;visibility:visible" o:bullet="t">
+      <v:shape id="_x0000_i1030" type="#_x0000_t75" alt="A blue square with white letters&#10;&#10;&#10;&#10;Description automatically generated" style="width:384pt;height:384pt;visibility:visible" o:bullet="t">
         <v:imagedata r:id="rId1" o:title="A blue square with white letters&#10;&#10;&#10;&#10;Description automatically generated"/>
       </v:shape>
     </w:pict>

</xml_diff>